<commit_message>
"Link in the body" is a constraint of the autoposter, not a rule it follows
Founder: the autoposter has no comment API, so it MUST put links in the body. Stating it
as a rule implies an alternative placement exists and the system merely prefers one. It
does not.

Reworded in both documents from a prohibition to a statement of the constraint, with the
consequence that actually matters for generation: copy must be written to carry a URL in
the body naturally rather than to defer it. A post composed as though the link is coming
later reads wrong when the link is sitting in the third line.

Word versions regenerated and verified by real text extraction — the old phrasing is gone
from both, the constraint is present in both.

Co-Authored-By: Claude Opus 5 <noreply@anthropic.com>
Claude-Session: https://claude.ai/code/session_01M4Z6V3c3eMgko9FCs2dnki
</commit_message>
<xml_diff>
--- a/docs/launch/BLITZ-DISTI-PACK-aeo-buyer-series.docx
+++ b/docs/launch/BLITZ-DISTI-PACK-aeo-buyer-series.docx
@@ -30,12 +30,17 @@
     </w:p>
     <w:p>
       <w:r>
-        <w:t>Standing rules applied throughout: the link is always in the body, never "link in the</w:t>
+        <w:t>Standing rules applied throughout: every post carries its link in the body — the</w:t>
       </w:r>
     </w:p>
     <w:p>
       <w:r>
-        <w:t>comments". No cost or expense figure appears anywhere. Every number is one we can</w:t>
+        <w:t>autoposter has no comment API, so there is no other placement, and the copy is written to</w:t>
+      </w:r>
+    </w:p>
+    <w:p>
+      <w:r>
+        <w:t>carry the URL naturally. No cost or expense figure appears anywhere. Every number is one we can</w:t>
       </w:r>
     </w:p>
     <w:p>

</xml_diff>

<commit_message>
The disti packs still promised runs the product does not perform
Post 6 in Pack 1 (LinkedIn and X) and its Bluesky version in the 5-6-7 pack
said "several times each" / "several runs each" — the same claim corrected on
the site on 22 September. At the panel size we sell, a twelve-question sweep
runs each question once per engine; fewer questions buy more runs. The packs
now say "one or more times each, depending on how many questions you ask, and
the per-cell N is printed on every number", matching the app and the blog.

Both packs regenerated from their generators, X and Bluesky length guards
re-run at build, and every output — md and both docx — text-extracted and
asserted free of "several", "265", "Read My Site" and "in sixteen".

Co-Authored-By: Claude Fable 5.1 <noreply@anthropic.com>
Claude-Session: https://claude.ai/code/session_01M4Z6V3c3eMgko9FCs2dnki
</commit_message>
<xml_diff>
--- a/docs/launch/BLITZ-DISTI-PACK-aeo-buyer-series.docx
+++ b/docs/launch/BLITZ-DISTI-PACK-aeo-buyer-series.docx
@@ -1282,7 +1282,7 @@
         <w:shd w:val="clear" w:fill="F2F4F5"/>
       </w:pPr>
       <w:r>
-        <w:t>We read your site. We ask four answer engines your buyers' questions, several times each, with web search on. We keep search-grounded answers separate from ones the model produced from memory, because blending them moves a score invisibly.</w:t>
+        <w:t>We read your site. We ask four answer engines your buyers' questions with web search on — one or more times each, depending on how many questions you ask, and the per-cell N is printed on every number. We keep search-grounded answers separate from ones the model produced from memory, because blending them moves a score invisibly.</w:t>
       </w:r>
     </w:p>
     <w:p>
@@ -1370,7 +1370,7 @@
         <w:shd w:val="clear" w:fill="F2F4F5"/>
       </w:pPr>
       <w:r>
-        <w:t>Four engines, buyers' questions, several runs each. Search-grounded answers kept separate from memory. Three layers scored separately, every number backed by a stored transcript you can re-run.</w:t>
+        <w:t>Four engines, buyers' questions, one or more runs each. Search-grounded answers kept separate from memory. Three layers scored separately, every number backed by a stored transcript you can re-run.</w:t>
       </w:r>
     </w:p>
     <w:p>

</xml_diff>